<commit_message>
Record the author's review of the test split; report who checked what
The author reviewed all 273 test-split items with dataset verify --recheck
and accepted all 273 unchanged. The 120 dev items rest on the two model
passes.

The review tool overwrote each item's notes with 'verified <date>', erasing
the record of the model passes. Accepting now appends to the notes; the 273
reviewed items have their history restored, followed by 'verified
2026-09-24 by Dhruv'.

Report banners now distinguish three cases -- all model-verified, a mix
(with counts), and all person-reviewed after model passes -- and the one-word
label in check-script headers does the same. All reports regenerated from
cache; only banners changed. The paper, IEEE version, slides, README and
PLAN describe the review as it happened: not blind, one person, test split
only, so there is still no inter-annotator agreement figure.
</commit_message>
<xml_diff>
--- a/paper/IndicRAG-QA-IEEE.docx
+++ b/paper/IndicRAG-QA-IEEE.docx
@@ -105,7 +105,7 @@
           <w:rFonts w:ascii="Times New Roman" w:hAnsi="Times New Roman"/>
           <w:sz w:val="20"/>
         </w:rPr>
-        <w:t>, which scores each candidate over the retrievers eligible to return it, recovers 0.685 (+0.411, p = 0.0001) at no monolingual cost; its gain over dense retrieval alone is small (+0.030) and significant only on code-mixed queries. End to end, retrieval raises the share of answers supported by their cited evidence from 0.184 to 0.870, while the choice of retriever does not reach answer quality. For abstention, the BM25 top score separates answerable from unanswerable questions (AUC 0.791) where the fused score does not, and the generator's own abstention catches 22 of 23 near-miss questions. We release a 393-item QA set with a query-language × evidence-language matrix and a four-class unanswerable taxonomy, verified by a language model rather than by a person.</w:t>
+        <w:t>, which scores each candidate over the retrievers eligible to return it, recovers 0.685 (+0.411, p = 0.0001) at no monolingual cost; its gain over dense retrieval alone is small (+0.030) and significant only on code-mixed queries. End to end, retrieval raises the share of answers supported by their cited evidence from 0.184 to 0.870, while the choice of retriever does not reach answer quality. For abstention, the BM25 top score separates answerable from unanswerable questions (AUC 0.791) where the fused score does not, and the generator's own abstention catches 22 of 23 near-miss questions. We release a 393-item QA set with a query-language × evidence-language matrix and a four-class unanswerable taxonomy, verified in two language-model passes with its test split reviewed by a person.</w:t>
       </w:r>
     </w:p>
     <w:p>
@@ -269,7 +269,7 @@
           <w:rFonts w:ascii="Times New Roman" w:hAnsi="Times New Roman"/>
           <w:sz w:val="20"/>
         </w:rPr>
-        <w:t xml:space="preserve"> of 393 items over six query-language × evidence-language cells and four unanswerable classes, with a sealed dev/test split. It was verified by a language model in two independent passes, not by a person, and every result states this.</w:t>
+        <w:t xml:space="preserve"> of 393 items over six query-language × evidence-language cells and four unanswerable classes, with a sealed dev/test split. It was verified in two independent language-model passes, and its test split was then reviewed by a person.</w:t>
       </w:r>
     </w:p>
     <w:p>
@@ -1432,14 +1432,14 @@
           <w:b/>
           <w:sz w:val="20"/>
         </w:rPr>
-        <w:t>Verification was carried out by a language model (Claude Opus 5.5), not by a person.</w:t>
+        <w:t>Verification began with a language model (Claude Opus 5.5) and ended with a person.</w:t>
       </w:r>
       <w:r>
         <w:rPr>
           <w:rFonts w:ascii="Times New Roman" w:hAnsi="Times New Roman"/>
           <w:sz w:val="20"/>
         </w:rPr>
-        <w:t xml:space="preserve"> A first pass read every item against its evidence and found 63 answerable items whose gold answer the passage contradicted or did not state, and 112 questions that were unreadable machine translation; these were corrected or replaced. A second pass by fresh instances confirmed 353 items, corrected 42 and rejected 5, and added other-language passages stating the same fact to 73 items. The result is 393 items (313 answerable, 80 unanswerable). A blind re-labelling of 59 items by another model instance agreed perfectly (κ = 1.000); that measures one model's consistency, not agreement between annotators. The set was split once, stratified by query language, answerability and scheme (seed 20260922): </w:t>
+        <w:t xml:space="preserve"> A first pass read every item against its evidence and found 63 answerable items whose gold answer the passage contradicted or did not state, and 112 questions that were unreadable machine translation; these were corrected or replaced. A second pass by fresh instances confirmed 353 items, corrected 42 and rejected 5, and added other-language passages stating the same fact to 73 items. The result is 393 items (313 answerable, 80 unanswerable). The author then reviewed all 273 test-split items against their evidence, with the model's notes shown, and accepted all 273 unchanged; the 120 dev items, used only for fitting thresholds, rest on the model passes. A blind re-labelling of 59 items by another model instance agreed perfectly (κ = 1.000); that measures one model's consistency, not agreement between annotators. The set was split once, stratified by query language, answerability and scheme (seed 20260922): </w:t>
       </w:r>
       <w:r>
         <w:rPr>
@@ -5511,14 +5511,14 @@
           <w:b/>
           <w:sz w:val="20"/>
         </w:rPr>
-        <w:t>No person verified the evaluation set.</w:t>
+        <w:t>One annotator, not blind.</w:t>
       </w:r>
       <w:r>
         <w:rPr>
           <w:rFonts w:ascii="Times New Roman" w:hAnsi="Times New Roman"/>
           <w:sz w:val="20"/>
         </w:rPr>
-        <w:t xml:space="preserve"> Both verification passes and the blind second pass were run by a language model; κ = 1.000 between model instances measures consistency, not the inter-annotator agreement the protocol required, and a gold set checked only by a model inherits its judgement. A human pass over at least the test split is the most valuable outstanding work. </w:t>
+        <w:t xml:space="preserve"> The person who reviewed the test split saw the model's verdicts and accepted every item, which confirms the model passes rather than measuring agreement with them; the dev split rests on the model passes alone; and the blind second pass was a model instance, so κ = 1.000 measures consistency, not the inter-annotator agreement the protocol required. An independent, blind second annotator is the most valuable outstanding work. </w:t>
       </w:r>
       <w:r>
         <w:rPr>
@@ -5576,7 +5576,7 @@
           <w:rFonts w:ascii="Times New Roman" w:hAnsi="Times New Roman"/>
           <w:sz w:val="20"/>
         </w:rPr>
-        <w:t>Reciprocal Rank Fusion applied unmodified to a lexical and a dense retriever over a bilingual collection penalises cross-script passages for the lexical retriever's inability to return them, discarding the only informative evidence in exactly the cross-lingual and code-mixed cases such a system exists to serve. Scoring each candidate over the retrievers eligible to return it corrects this — cross-lingual Recall@5 from 0.274 to 0.685 on our test split, with no monolingual cost and no training — though over a strong dense retriever alone the corrected hybrid gains little. The result was invisible in the aggregate metrics and was recovered from a structured reading of failure cases. Future work is a human verification pass, a non-Devanagari Indic script, and the eligibility formulation outside language.</w:t>
+        <w:t>Reciprocal Rank Fusion applied unmodified to a lexical and a dense retriever over a bilingual collection penalises cross-script passages for the lexical retriever's inability to return them, discarding the only informative evidence in exactly the cross-lingual and code-mixed cases such a system exists to serve. Scoring each candidate over the retrievers eligible to return it corrects this — cross-lingual Recall@5 from 0.274 to 0.685 on our test split, with no monolingual cost and no training — though over a strong dense retriever alone the corrected hybrid gains little. The result was invisible in the aggregate metrics and was recovered from a structured reading of failure cases. Future work is an independent second annotator, a non-Devanagari Indic script, and the eligibility formulation outside language.</w:t>
       </w:r>
     </w:p>
     <w:p>

</xml_diff>

<commit_message>
Link the live demo from the README, both papers and the slides
indicragqa.vercel.app and the GitHub repository now appear under the
author block of the full and IEEE papers, at the top of the README, and on
the title and closing slides. PDFs, docx and pptx rebuilt.
</commit_message>
<xml_diff>
--- a/paper/IndicRAG-QA-IEEE.docx
+++ b/paper/IndicRAG-QA-IEEE.docx
@@ -53,6 +53,19 @@
           <w:sz w:val="20"/>
         </w:rPr>
         <w:t>CSET 346 — Natural Language Processing</w:t>
+      </w:r>
+    </w:p>
+    <w:p>
+      <w:pPr>
+        <w:spacing w:after="0"/>
+        <w:jc w:val="center"/>
+      </w:pPr>
+      <w:r>
+        <w:rPr>
+          <w:rFonts w:ascii="Times New Roman" w:hAnsi="Times New Roman"/>
+          <w:sz w:val="18"/>
+        </w:rPr>
+        <w:t>Demo: indicragqa.vercel.app · Code: github.com/dhruvv1402/IndicRAG-QA</w:t>
       </w:r>
     </w:p>
     <w:p>

</xml_diff>